<commit_message>
Updating to Latest Documentation
</commit_message>
<xml_diff>
--- a/BubbleFish - Planning/Build/2.0/2026.03.26 - BubbleFish_BUILD_PLAN.docx
+++ b/BubbleFish - Planning/Build/2.0/2026.03.26 - BubbleFish_BUILD_PLAN.docx
@@ -527,12 +527,6 @@
         <w:gridCol w:w="9360"/>
       </w:tblGrid>
       <w:tr>
-        <w:tblPrEx>
-          <w:tblCellMar>
-            <w:top w:w="0" w:type="dxa"/>
-            <w:bottom w:w="0" w:type="dxa"/>
-          </w:tblCellMar>
-        </w:tblPrEx>
         <w:tc>
           <w:tcPr>
             <w:tcW w:w="9360" w:type="dxa"/>
@@ -789,12 +783,6 @@
         <w:gridCol w:w="3600"/>
       </w:tblGrid>
       <w:tr>
-        <w:tblPrEx>
-          <w:tblCellMar>
-            <w:top w:w="0" w:type="dxa"/>
-            <w:bottom w:w="0" w:type="dxa"/>
-          </w:tblCellMar>
-        </w:tblPrEx>
         <w:tc>
           <w:tcPr>
             <w:tcW w:w="900" w:type="dxa"/>
@@ -917,12 +905,6 @@
         </w:tc>
       </w:tr>
       <w:tr>
-        <w:tblPrEx>
-          <w:tblCellMar>
-            <w:top w:w="0" w:type="dxa"/>
-            <w:bottom w:w="0" w:type="dxa"/>
-          </w:tblCellMar>
-        </w:tblPrEx>
         <w:tc>
           <w:tcPr>
             <w:tcW w:w="900" w:type="dxa"/>
@@ -1033,12 +1015,6 @@
         </w:tc>
       </w:tr>
       <w:tr>
-        <w:tblPrEx>
-          <w:tblCellMar>
-            <w:top w:w="0" w:type="dxa"/>
-            <w:bottom w:w="0" w:type="dxa"/>
-          </w:tblCellMar>
-        </w:tblPrEx>
         <w:tc>
           <w:tcPr>
             <w:tcW w:w="900" w:type="dxa"/>
@@ -1149,12 +1125,6 @@
         </w:tc>
       </w:tr>
       <w:tr>
-        <w:tblPrEx>
-          <w:tblCellMar>
-            <w:top w:w="0" w:type="dxa"/>
-            <w:bottom w:w="0" w:type="dxa"/>
-          </w:tblCellMar>
-        </w:tblPrEx>
         <w:tc>
           <w:tcPr>
             <w:tcW w:w="900" w:type="dxa"/>
@@ -1265,12 +1235,6 @@
         </w:tc>
       </w:tr>
       <w:tr>
-        <w:tblPrEx>
-          <w:tblCellMar>
-            <w:top w:w="0" w:type="dxa"/>
-            <w:bottom w:w="0" w:type="dxa"/>
-          </w:tblCellMar>
-        </w:tblPrEx>
         <w:tc>
           <w:tcPr>
             <w:tcW w:w="900" w:type="dxa"/>
@@ -1381,12 +1345,6 @@
         </w:tc>
       </w:tr>
       <w:tr>
-        <w:tblPrEx>
-          <w:tblCellMar>
-            <w:top w:w="0" w:type="dxa"/>
-            <w:bottom w:w="0" w:type="dxa"/>
-          </w:tblCellMar>
-        </w:tblPrEx>
         <w:tc>
           <w:tcPr>
             <w:tcW w:w="900" w:type="dxa"/>
@@ -1497,12 +1455,6 @@
         </w:tc>
       </w:tr>
       <w:tr>
-        <w:tblPrEx>
-          <w:tblCellMar>
-            <w:top w:w="0" w:type="dxa"/>
-            <w:bottom w:w="0" w:type="dxa"/>
-          </w:tblCellMar>
-        </w:tblPrEx>
         <w:tc>
           <w:tcPr>
             <w:tcW w:w="900" w:type="dxa"/>
@@ -1613,12 +1565,6 @@
         </w:tc>
       </w:tr>
       <w:tr>
-        <w:tblPrEx>
-          <w:tblCellMar>
-            <w:top w:w="0" w:type="dxa"/>
-            <w:bottom w:w="0" w:type="dxa"/>
-          </w:tblCellMar>
-        </w:tblPrEx>
         <w:tc>
           <w:tcPr>
             <w:tcW w:w="900" w:type="dxa"/>
@@ -1729,12 +1675,6 @@
         </w:tc>
       </w:tr>
       <w:tr>
-        <w:tblPrEx>
-          <w:tblCellMar>
-            <w:top w:w="0" w:type="dxa"/>
-            <w:bottom w:w="0" w:type="dxa"/>
-          </w:tblCellMar>
-        </w:tblPrEx>
         <w:tc>
           <w:tcPr>
             <w:tcW w:w="900" w:type="dxa"/>
@@ -1949,12 +1889,6 @@
         <w:gridCol w:w="9360"/>
       </w:tblGrid>
       <w:tr>
-        <w:tblPrEx>
-          <w:tblCellMar>
-            <w:top w:w="0" w:type="dxa"/>
-            <w:bottom w:w="0" w:type="dxa"/>
-          </w:tblCellMar>
-        </w:tblPrEx>
         <w:tc>
           <w:tcPr>
             <w:tcW w:w="9360" w:type="dxa"/>
@@ -2075,7 +2009,16 @@
                 <w:sz w:val="18"/>
                 <w:szCs w:val="18"/>
               </w:rPr>
-              <w:t>go mod init github.com/shawnsammartano/bubblefish</w:t>
+              <w:t xml:space="preserve">go mod init </w:t>
+            </w:r>
+            <w:r>
+              <w:rPr>
+                <w:rFonts w:ascii="Consolas" w:eastAsia="Consolas" w:hAnsi="Consolas" w:cs="Consolas"/>
+                <w:color w:val="1F2937"/>
+                <w:sz w:val="18"/>
+                <w:szCs w:val="18"/>
+              </w:rPr>
+              <w:t>github.com/shawnsammartano-hub/BubbleFish</w:t>
             </w:r>
           </w:p>
           <w:p/>
@@ -2110,6 +2053,26 @@
                 <w:szCs w:val="18"/>
               </w:rPr>
               <w:t>go get github.com/spf13/cobra@v1.8.0</w:t>
+            </w:r>
+          </w:p>
+          <w:p>
+            <w:r>
+              <w:rPr>
+                <w:rFonts w:ascii="Consolas" w:eastAsia="Consolas" w:hAnsi="Consolas" w:cs="Consolas"/>
+                <w:color w:val="1F2937"/>
+                <w:sz w:val="18"/>
+                <w:szCs w:val="18"/>
+              </w:rPr>
+              <w:t>go</w:t>
+            </w:r>
+            <w:r>
+              <w:rPr>
+                <w:rFonts w:ascii="Consolas" w:eastAsia="Consolas" w:hAnsi="Consolas" w:cs="Consolas"/>
+                <w:color w:val="1F2937"/>
+                <w:sz w:val="18"/>
+                <w:szCs w:val="18"/>
+              </w:rPr>
+              <w:t xml:space="preserve"> mod tidy</w:t>
             </w:r>
           </w:p>
           <w:p/>
@@ -2339,12 +2302,6 @@
         <w:gridCol w:w="9360"/>
       </w:tblGrid>
       <w:tr>
-        <w:tblPrEx>
-          <w:tblCellMar>
-            <w:top w:w="0" w:type="dxa"/>
-            <w:bottom w:w="0" w:type="dxa"/>
-          </w:tblCellMar>
-        </w:tblPrEx>
         <w:tc>
           <w:tcPr>
             <w:tcW w:w="9360" w:type="dxa"/>
@@ -2516,6 +2473,14 @@
             </w:r>
           </w:p>
           <w:p>
+            <w:pPr>
+              <w:rPr>
+                <w:rFonts w:ascii="Consolas" w:eastAsia="Consolas" w:hAnsi="Consolas" w:cs="Consolas"/>
+                <w:color w:val="1F2937"/>
+                <w:sz w:val="18"/>
+                <w:szCs w:val="18"/>
+              </w:rPr>
+            </w:pPr>
             <w:r>
               <w:rPr>
                 <w:rFonts w:ascii="Consolas" w:eastAsia="Consolas" w:hAnsi="Consolas" w:cs="Consolas"/>
@@ -2524,6 +2489,53 @@
                 <w:szCs w:val="18"/>
               </w:rPr>
               <w:t>go test ./internal/config/... -v</w:t>
+            </w:r>
+            <w:r>
+              <w:rPr>
+                <w:rFonts w:ascii="Consolas" w:eastAsia="Consolas" w:hAnsi="Consolas" w:cs="Consolas"/>
+                <w:color w:val="1F2937"/>
+                <w:sz w:val="18"/>
+                <w:szCs w:val="18"/>
+              </w:rPr>
+              <w:br/>
+            </w:r>
+          </w:p>
+          <w:p>
+            <w:r>
+              <w:rPr>
+                <w:rFonts w:ascii="Consolas" w:eastAsia="Consolas" w:hAnsi="Consolas" w:cs="Consolas"/>
+                <w:color w:val="1F2937"/>
+                <w:sz w:val="18"/>
+                <w:szCs w:val="18"/>
+              </w:rPr>
+              <w:t>#</w:t>
+            </w:r>
+            <w:r>
+              <w:rPr>
+                <w:rFonts w:ascii="Consolas" w:eastAsia="Consolas" w:hAnsi="Consolas" w:cs="Consolas"/>
+                <w:color w:val="1F2937"/>
+                <w:sz w:val="18"/>
+                <w:szCs w:val="18"/>
+              </w:rPr>
+              <w:br/>
+            </w:r>
+            <w:r>
+              <w:rPr>
+                <w:rFonts w:ascii="Consolas" w:eastAsia="Consolas" w:hAnsi="Consolas" w:cs="Consolas"/>
+                <w:color w:val="1F2937"/>
+                <w:sz w:val="18"/>
+                <w:szCs w:val="18"/>
+              </w:rPr>
+              <w:t>go</w:t>
+            </w:r>
+            <w:r>
+              <w:rPr>
+                <w:rFonts w:ascii="Consolas" w:eastAsia="Consolas" w:hAnsi="Consolas" w:cs="Consolas"/>
+                <w:color w:val="1F2937"/>
+                <w:sz w:val="18"/>
+                <w:szCs w:val="18"/>
+              </w:rPr>
+              <w:t xml:space="preserve"> mod tidy</w:t>
             </w:r>
           </w:p>
         </w:tc>
@@ -2815,12 +2827,6 @@
         <w:gridCol w:w="9360"/>
       </w:tblGrid>
       <w:tr>
-        <w:tblPrEx>
-          <w:tblCellMar>
-            <w:top w:w="0" w:type="dxa"/>
-            <w:bottom w:w="0" w:type="dxa"/>
-          </w:tblCellMar>
-        </w:tblPrEx>
         <w:tc>
           <w:tcPr>
             <w:tcW w:w="9360" w:type="dxa"/>
@@ -3145,12 +3151,6 @@
         <w:gridCol w:w="9360"/>
       </w:tblGrid>
       <w:tr>
-        <w:tblPrEx>
-          <w:tblCellMar>
-            <w:top w:w="0" w:type="dxa"/>
-            <w:bottom w:w="0" w:type="dxa"/>
-          </w:tblCellMar>
-        </w:tblPrEx>
         <w:tc>
           <w:tcPr>
             <w:tcW w:w="9360" w:type="dxa"/>
@@ -3783,12 +3783,6 @@
         <w:gridCol w:w="9360"/>
       </w:tblGrid>
       <w:tr>
-        <w:tblPrEx>
-          <w:tblCellMar>
-            <w:top w:w="0" w:type="dxa"/>
-            <w:bottom w:w="0" w:type="dxa"/>
-          </w:tblCellMar>
-        </w:tblPrEx>
         <w:tc>
           <w:tcPr>
             <w:tcW w:w="9360" w:type="dxa"/>
@@ -4026,12 +4020,6 @@
         <w:gridCol w:w="9360"/>
       </w:tblGrid>
       <w:tr>
-        <w:tblPrEx>
-          <w:tblCellMar>
-            <w:top w:w="0" w:type="dxa"/>
-            <w:bottom w:w="0" w:type="dxa"/>
-          </w:tblCellMar>
-        </w:tblPrEx>
         <w:tc>
           <w:tcPr>
             <w:tcW w:w="9360" w:type="dxa"/>
@@ -4658,12 +4646,6 @@
         <w:gridCol w:w="9360"/>
       </w:tblGrid>
       <w:tr>
-        <w:tblPrEx>
-          <w:tblCellMar>
-            <w:top w:w="0" w:type="dxa"/>
-            <w:bottom w:w="0" w:type="dxa"/>
-          </w:tblCellMar>
-        </w:tblPrEx>
         <w:tc>
           <w:tcPr>
             <w:tcW w:w="9360" w:type="dxa"/>
@@ -4923,12 +4905,6 @@
         <w:gridCol w:w="9360"/>
       </w:tblGrid>
       <w:tr>
-        <w:tblPrEx>
-          <w:tblCellMar>
-            <w:top w:w="0" w:type="dxa"/>
-            <w:bottom w:w="0" w:type="dxa"/>
-          </w:tblCellMar>
-        </w:tblPrEx>
         <w:tc>
           <w:tcPr>
             <w:tcW w:w="9360" w:type="dxa"/>
@@ -5820,12 +5796,6 @@
         <w:gridCol w:w="9360"/>
       </w:tblGrid>
       <w:tr>
-        <w:tblPrEx>
-          <w:tblCellMar>
-            <w:top w:w="0" w:type="dxa"/>
-            <w:bottom w:w="0" w:type="dxa"/>
-          </w:tblCellMar>
-        </w:tblPrEx>
         <w:tc>
           <w:tcPr>
             <w:tcW w:w="9360" w:type="dxa"/>
@@ -6051,12 +6021,6 @@
         <w:gridCol w:w="9360"/>
       </w:tblGrid>
       <w:tr>
-        <w:tblPrEx>
-          <w:tblCellMar>
-            <w:top w:w="0" w:type="dxa"/>
-            <w:bottom w:w="0" w:type="dxa"/>
-          </w:tblCellMar>
-        </w:tblPrEx>
         <w:tc>
           <w:tcPr>
             <w:tcW w:w="9360" w:type="dxa"/>
@@ -6632,12 +6596,6 @@
         <w:gridCol w:w="9360"/>
       </w:tblGrid>
       <w:tr>
-        <w:tblPrEx>
-          <w:tblCellMar>
-            <w:top w:w="0" w:type="dxa"/>
-            <w:bottom w:w="0" w:type="dxa"/>
-          </w:tblCellMar>
-        </w:tblPrEx>
         <w:tc>
           <w:tcPr>
             <w:tcW w:w="9360" w:type="dxa"/>
@@ -6828,12 +6786,6 @@
         <w:gridCol w:w="9360"/>
       </w:tblGrid>
       <w:tr>
-        <w:tblPrEx>
-          <w:tblCellMar>
-            <w:top w:w="0" w:type="dxa"/>
-            <w:bottom w:w="0" w:type="dxa"/>
-          </w:tblCellMar>
-        </w:tblPrEx>
         <w:tc>
           <w:tcPr>
             <w:tcW w:w="9360" w:type="dxa"/>
@@ -7442,12 +7394,6 @@
         <w:gridCol w:w="9360"/>
       </w:tblGrid>
       <w:tr>
-        <w:tblPrEx>
-          <w:tblCellMar>
-            <w:top w:w="0" w:type="dxa"/>
-            <w:bottom w:w="0" w:type="dxa"/>
-          </w:tblCellMar>
-        </w:tblPrEx>
         <w:tc>
           <w:tcPr>
             <w:tcW w:w="9360" w:type="dxa"/>
@@ -8031,12 +7977,6 @@
         <w:gridCol w:w="9360"/>
       </w:tblGrid>
       <w:tr>
-        <w:tblPrEx>
-          <w:tblCellMar>
-            <w:top w:w="0" w:type="dxa"/>
-            <w:bottom w:w="0" w:type="dxa"/>
-          </w:tblCellMar>
-        </w:tblPrEx>
         <w:tc>
           <w:tcPr>
             <w:tcW w:w="9360" w:type="dxa"/>
@@ -8598,12 +8538,6 @@
         <w:gridCol w:w="9360"/>
       </w:tblGrid>
       <w:tr>
-        <w:tblPrEx>
-          <w:tblCellMar>
-            <w:top w:w="0" w:type="dxa"/>
-            <w:bottom w:w="0" w:type="dxa"/>
-          </w:tblCellMar>
-        </w:tblPrEx>
         <w:tc>
           <w:tcPr>
             <w:tcW w:w="9360" w:type="dxa"/>
@@ -8758,7 +8692,25 @@
                 <w:sz w:val="18"/>
                 <w:szCs w:val="18"/>
               </w:rPr>
-              <w:t>git remote add origin https://github.com/shawnsammartano/bubblefish.git</w:t>
+              <w:t>git remote add origin https://</w:t>
+            </w:r>
+            <w:r>
+              <w:rPr>
+                <w:rFonts w:ascii="Consolas" w:eastAsia="Consolas" w:hAnsi="Consolas" w:cs="Consolas"/>
+                <w:color w:val="1F2937"/>
+                <w:sz w:val="18"/>
+                <w:szCs w:val="18"/>
+              </w:rPr>
+              <w:t>github.com/shawnsammartano-hub/BubbleFish</w:t>
+            </w:r>
+            <w:r>
+              <w:rPr>
+                <w:rFonts w:ascii="Consolas" w:eastAsia="Consolas" w:hAnsi="Consolas" w:cs="Consolas"/>
+                <w:color w:val="1F2937"/>
+                <w:sz w:val="18"/>
+                <w:szCs w:val="18"/>
+              </w:rPr>
+              <w:t>.git</w:t>
             </w:r>
           </w:p>
           <w:p>
@@ -9258,12 +9210,6 @@
         <w:gridCol w:w="9360"/>
       </w:tblGrid>
       <w:tr>
-        <w:tblPrEx>
-          <w:tblCellMar>
-            <w:top w:w="0" w:type="dxa"/>
-            <w:bottom w:w="0" w:type="dxa"/>
-          </w:tblCellMar>
-        </w:tblPrEx>
         <w:tc>
           <w:tcPr>
             <w:tcW w:w="9360" w:type="dxa"/>

</xml_diff>